<commit_message>
feat: change preview of asignment
</commit_message>
<xml_diff>
--- a/Lampiran 5.docx
+++ b/Lampiran 5.docx
@@ -9904,15 +9904,15 @@
               <w:jc w:val="both"/>
               <w:rPr>
                 <w:rFonts w:ascii="Times New Roman"/>
-                <w:sz w:val="20"/>
-                <w:szCs w:val="20"/>
+                <w:sz w:val="21"/>
+                <w:szCs w:val="21"/>
               </w:rPr>
             </w:pPr>
             <w:r>
               <w:rPr>
                 <w:rFonts w:ascii="Times New Roman"/>
-                <w:sz w:val="20"/>
-                <w:szCs w:val="20"/>
+                <w:sz w:val="21"/>
+                <w:szCs w:val="21"/>
               </w:rPr>
               <w:t xml:space="preserve">Google Gemini </w:t>
             </w:r>
@@ -9920,8 +9920,8 @@
             <w:r>
               <w:rPr>
                 <w:rFonts w:ascii="Times New Roman"/>
-                <w:sz w:val="20"/>
-                <w:szCs w:val="20"/>
+                <w:sz w:val="21"/>
+                <w:szCs w:val="21"/>
               </w:rPr>
               <w:t>Flash</w:t>
             </w:r>
@@ -9929,8 +9929,8 @@
             <w:r>
               <w:rPr>
                 <w:rFonts w:ascii="Times New Roman"/>
-                <w:sz w:val="20"/>
-                <w:szCs w:val="20"/>
+                <w:sz w:val="21"/>
+                <w:szCs w:val="21"/>
               </w:rPr>
               <w:t xml:space="preserve"> API</w:t>
             </w:r>
@@ -9947,15 +9947,15 @@
               <w:jc w:val="both"/>
               <w:rPr>
                 <w:rFonts w:ascii="Times New Roman"/>
-                <w:sz w:val="20"/>
-                <w:szCs w:val="20"/>
+                <w:sz w:val="21"/>
+                <w:szCs w:val="21"/>
               </w:rPr>
             </w:pPr>
             <w:r>
               <w:rPr>
                 <w:rFonts w:ascii="Times New Roman"/>
-                <w:sz w:val="20"/>
-                <w:szCs w:val="20"/>
+                <w:sz w:val="21"/>
+                <w:szCs w:val="21"/>
               </w:rPr>
               <w:t>Mendukung fitur "Tutor AI" interaktif dan pembuatan "Kuis Generatif" otomatis untuk evaluasi siswa pada materi Farmakognosi.</w:t>
             </w:r>
@@ -9972,15 +9972,15 @@
               <w:jc w:val="both"/>
               <w:rPr>
                 <w:rFonts w:ascii="Times New Roman"/>
-                <w:sz w:val="20"/>
-                <w:szCs w:val="20"/>
+                <w:sz w:val="21"/>
+                <w:szCs w:val="21"/>
               </w:rPr>
             </w:pPr>
             <w:r>
               <w:rPr>
                 <w:rFonts w:ascii="Times New Roman"/>
-                <w:sz w:val="20"/>
-                <w:szCs w:val="20"/>
+                <w:sz w:val="21"/>
+                <w:szCs w:val="21"/>
               </w:rPr>
               <w:t>Merancang arsitektur integrasi mandiri berbasis RAG (</w:t>
             </w:r>
@@ -9988,8 +9988,10 @@
             <w:r>
               <w:rPr>
                 <w:rFonts w:ascii="Times New Roman"/>
-                <w:sz w:val="20"/>
-                <w:szCs w:val="20"/>
+                <w:i/>
+                <w:iCs/>
+                <w:sz w:val="21"/>
+                <w:szCs w:val="21"/>
               </w:rPr>
               <w:t>Retrieval-Augmented</w:t>
             </w:r>
@@ -9997,8 +9999,10 @@
             <w:r>
               <w:rPr>
                 <w:rFonts w:ascii="Times New Roman"/>
-                <w:sz w:val="20"/>
-                <w:szCs w:val="20"/>
+                <w:i/>
+                <w:iCs/>
+                <w:sz w:val="21"/>
+                <w:szCs w:val="21"/>
               </w:rPr>
               <w:t xml:space="preserve"> </w:t>
             </w:r>
@@ -10006,8 +10010,10 @@
             <w:r>
               <w:rPr>
                 <w:rFonts w:ascii="Times New Roman"/>
-                <w:sz w:val="20"/>
-                <w:szCs w:val="20"/>
+                <w:i/>
+                <w:iCs/>
+                <w:sz w:val="21"/>
+                <w:szCs w:val="21"/>
               </w:rPr>
               <w:t>Generation</w:t>
             </w:r>
@@ -10015,8 +10021,8 @@
             <w:r>
               <w:rPr>
                 <w:rFonts w:ascii="Times New Roman"/>
-                <w:sz w:val="20"/>
-                <w:szCs w:val="20"/>
+                <w:sz w:val="21"/>
+                <w:szCs w:val="21"/>
               </w:rPr>
               <w:t xml:space="preserve">). Penyiapan basis vektor dengan </w:t>
             </w:r>
@@ -10024,8 +10030,8 @@
             <w:r>
               <w:rPr>
                 <w:rFonts w:ascii="Times New Roman"/>
-                <w:sz w:val="20"/>
-                <w:szCs w:val="20"/>
+                <w:sz w:val="21"/>
+                <w:szCs w:val="21"/>
               </w:rPr>
               <w:t>pgvector</w:t>
             </w:r>
@@ -10033,8 +10039,8 @@
             <w:r>
               <w:rPr>
                 <w:rFonts w:ascii="Times New Roman"/>
-                <w:sz w:val="20"/>
-                <w:szCs w:val="20"/>
+                <w:sz w:val="21"/>
+                <w:szCs w:val="21"/>
               </w:rPr>
               <w:t xml:space="preserve"> (</w:t>
             </w:r>
@@ -10042,8 +10048,8 @@
             <w:r>
               <w:rPr>
                 <w:rFonts w:ascii="Times New Roman"/>
-                <w:sz w:val="20"/>
-                <w:szCs w:val="20"/>
+                <w:sz w:val="21"/>
+                <w:szCs w:val="21"/>
               </w:rPr>
               <w:t>Supabase</w:t>
             </w:r>
@@ -10051,8 +10057,8 @@
             <w:r>
               <w:rPr>
                 <w:rFonts w:ascii="Times New Roman"/>
-                <w:sz w:val="20"/>
-                <w:szCs w:val="20"/>
+                <w:sz w:val="21"/>
+                <w:szCs w:val="21"/>
               </w:rPr>
               <w:t xml:space="preserve">), serta </w:t>
             </w:r>
@@ -10060,8 +10066,10 @@
             <w:r>
               <w:rPr>
                 <w:rFonts w:ascii="Times New Roman"/>
-                <w:sz w:val="20"/>
-                <w:szCs w:val="20"/>
+                <w:i/>
+                <w:iCs/>
+                <w:sz w:val="21"/>
+                <w:szCs w:val="21"/>
               </w:rPr>
               <w:t>prompt</w:t>
             </w:r>
@@ -10069,8 +10077,10 @@
             <w:r>
               <w:rPr>
                 <w:rFonts w:ascii="Times New Roman"/>
-                <w:sz w:val="20"/>
-                <w:szCs w:val="20"/>
+                <w:i/>
+                <w:iCs/>
+                <w:sz w:val="21"/>
+                <w:szCs w:val="21"/>
               </w:rPr>
               <w:t xml:space="preserve"> </w:t>
             </w:r>
@@ -10078,8 +10088,10 @@
             <w:r>
               <w:rPr>
                 <w:rFonts w:ascii="Times New Roman"/>
-                <w:sz w:val="20"/>
-                <w:szCs w:val="20"/>
+                <w:i/>
+                <w:iCs/>
+                <w:sz w:val="21"/>
+                <w:szCs w:val="21"/>
               </w:rPr>
               <w:t>engineering</w:t>
             </w:r>
@@ -10087,8 +10099,8 @@
             <w:r>
               <w:rPr>
                 <w:rFonts w:ascii="Times New Roman"/>
-                <w:sz w:val="20"/>
-                <w:szCs w:val="20"/>
+                <w:sz w:val="21"/>
+                <w:szCs w:val="21"/>
               </w:rPr>
               <w:t xml:space="preserve"> </w:t>
             </w:r>
@@ -10096,8 +10108,8 @@
             <w:r>
               <w:rPr>
                 <w:rFonts w:ascii="Times New Roman"/>
-                <w:sz w:val="20"/>
-                <w:szCs w:val="20"/>
+                <w:sz w:val="21"/>
+                <w:szCs w:val="21"/>
               </w:rPr>
               <w:t>kustom</w:t>
             </w:r>
@@ -10105,8 +10117,8 @@
             <w:r>
               <w:rPr>
                 <w:rFonts w:ascii="Times New Roman"/>
-                <w:sz w:val="20"/>
-                <w:szCs w:val="20"/>
+                <w:sz w:val="21"/>
+                <w:szCs w:val="21"/>
               </w:rPr>
               <w:t xml:space="preserve"> agar AI mematuhi persona spesifik sebagai asisten Farmakognosi tanpa halusinasi.</w:t>
             </w:r>
@@ -10156,6 +10168,24 @@
                 <w:szCs w:val="21"/>
               </w:rPr>
             </w:pPr>
+            <w:proofErr w:type="spellStart"/>
+            <w:r>
+              <w:rPr>
+                <w:rFonts w:ascii="Times New Roman"/>
+                <w:sz w:val="21"/>
+                <w:szCs w:val="21"/>
+              </w:rPr>
+              <w:t>Meshy</w:t>
+            </w:r>
+            <w:proofErr w:type="spellEnd"/>
+            <w:r>
+              <w:rPr>
+                <w:rFonts w:ascii="Times New Roman"/>
+                <w:sz w:val="21"/>
+                <w:szCs w:val="21"/>
+              </w:rPr>
+              <w:t xml:space="preserve"> AI</w:t>
+            </w:r>
           </w:p>
         </w:tc>
         <w:tc>
@@ -10166,12 +10196,95 @@
             <w:pPr>
               <w:pStyle w:val="TableParagraph"/>
               <w:spacing w:before="0"/>
+              <w:jc w:val="both"/>
               <w:rPr>
                 <w:rFonts w:ascii="Times New Roman"/>
                 <w:sz w:val="21"/>
                 <w:szCs w:val="21"/>
               </w:rPr>
             </w:pPr>
+            <w:r>
+              <w:rPr>
+                <w:rFonts w:ascii="Times New Roman"/>
+                <w:sz w:val="21"/>
+                <w:szCs w:val="21"/>
+              </w:rPr>
+              <w:t>Mendukung pembuatan aset 3D secara efisien dengan mengubah</w:t>
+            </w:r>
+            <w:r>
+              <w:rPr>
+                <w:rFonts w:ascii="Times New Roman"/>
+                <w:sz w:val="21"/>
+                <w:szCs w:val="21"/>
+              </w:rPr>
+              <w:t xml:space="preserve"> </w:t>
+            </w:r>
+            <w:r>
+              <w:rPr>
+                <w:rFonts w:ascii="Times New Roman"/>
+                <w:sz w:val="21"/>
+                <w:szCs w:val="21"/>
+              </w:rPr>
+              <w:t xml:space="preserve">foto nyata tanaman </w:t>
+            </w:r>
+            <w:r>
+              <w:rPr>
+                <w:rFonts w:ascii="Times New Roman"/>
+                <w:sz w:val="21"/>
+                <w:szCs w:val="21"/>
+              </w:rPr>
+              <w:t xml:space="preserve">dan alat laboratorium </w:t>
+            </w:r>
+            <w:r>
+              <w:rPr>
+                <w:rFonts w:ascii="Times New Roman"/>
+                <w:sz w:val="21"/>
+                <w:szCs w:val="21"/>
+              </w:rPr>
+              <w:t xml:space="preserve">menjadi model 3D dasar untuk divisualisasikan pada fitur </w:t>
+            </w:r>
+            <w:proofErr w:type="spellStart"/>
+            <w:r>
+              <w:rPr>
+                <w:rFonts w:ascii="Times New Roman"/>
+                <w:i/>
+                <w:iCs/>
+                <w:sz w:val="21"/>
+                <w:szCs w:val="21"/>
+              </w:rPr>
+              <w:t>Augmented</w:t>
+            </w:r>
+            <w:proofErr w:type="spellEnd"/>
+            <w:r>
+              <w:rPr>
+                <w:rFonts w:ascii="Times New Roman"/>
+                <w:i/>
+                <w:iCs/>
+                <w:sz w:val="21"/>
+                <w:szCs w:val="21"/>
+              </w:rPr>
+              <w:t xml:space="preserve"> </w:t>
+            </w:r>
+            <w:proofErr w:type="spellStart"/>
+            <w:r>
+              <w:rPr>
+                <w:rFonts w:ascii="Times New Roman"/>
+                <w:i/>
+                <w:iCs/>
+                <w:sz w:val="21"/>
+                <w:szCs w:val="21"/>
+              </w:rPr>
+              <w:t>Reality</w:t>
+            </w:r>
+            <w:proofErr w:type="spellEnd"/>
+            <w:r>
+              <w:rPr>
+                <w:rFonts w:ascii="Times New Roman"/>
+                <w:sz w:val="21"/>
+                <w:szCs w:val="21"/>
+              </w:rPr>
+              <w:t xml:space="preserve"> (AR) web.</w:t>
+            </w:r>
           </w:p>
         </w:tc>
         <w:tc>
@@ -10182,12 +10295,135 @@
             <w:pPr>
               <w:pStyle w:val="TableParagraph"/>
               <w:spacing w:before="0"/>
+              <w:jc w:val="both"/>
               <w:rPr>
                 <w:rFonts w:ascii="Times New Roman"/>
                 <w:sz w:val="21"/>
                 <w:szCs w:val="21"/>
               </w:rPr>
             </w:pPr>
+            <w:r>
+              <w:rPr>
+                <w:rFonts w:ascii="Times New Roman"/>
+                <w:sz w:val="21"/>
+                <w:szCs w:val="21"/>
+              </w:rPr>
+              <w:t>M</w:t>
+            </w:r>
+            <w:r>
+              <w:rPr>
+                <w:rFonts w:ascii="Times New Roman"/>
+                <w:sz w:val="21"/>
+                <w:szCs w:val="21"/>
+              </w:rPr>
+              <w:t xml:space="preserve">odel 3D </w:t>
+            </w:r>
+            <w:r>
+              <w:rPr>
+                <w:rFonts w:ascii="Times New Roman"/>
+                <w:sz w:val="21"/>
+                <w:szCs w:val="21"/>
+              </w:rPr>
+              <w:t xml:space="preserve">hasil </w:t>
+            </w:r>
+            <w:proofErr w:type="spellStart"/>
+            <w:r>
+              <w:rPr>
+                <w:rFonts w:ascii="Times New Roman"/>
+                <w:sz w:val="21"/>
+                <w:szCs w:val="21"/>
+              </w:rPr>
+              <w:t>Meshy</w:t>
+            </w:r>
+            <w:proofErr w:type="spellEnd"/>
+            <w:r>
+              <w:rPr>
+                <w:rFonts w:ascii="Times New Roman"/>
+                <w:sz w:val="21"/>
+                <w:szCs w:val="21"/>
+              </w:rPr>
+              <w:t xml:space="preserve"> AI </w:t>
+            </w:r>
+            <w:r>
+              <w:rPr>
+                <w:rFonts w:ascii="Times New Roman"/>
+                <w:sz w:val="21"/>
+                <w:szCs w:val="21"/>
+              </w:rPr>
+              <w:t>diprose</w:t>
+            </w:r>
+            <w:r>
+              <w:rPr>
+                <w:rFonts w:ascii="Times New Roman"/>
+                <w:sz w:val="21"/>
+                <w:szCs w:val="21"/>
+              </w:rPr>
+              <w:t>s</w:t>
+            </w:r>
+            <w:r>
+              <w:rPr>
+                <w:rFonts w:ascii="Times New Roman"/>
+                <w:sz w:val="21"/>
+                <w:szCs w:val="21"/>
+              </w:rPr>
+              <w:t xml:space="preserve">, </w:t>
+            </w:r>
+            <w:proofErr w:type="spellStart"/>
+            <w:r>
+              <w:rPr>
+                <w:rFonts w:ascii="Times New Roman"/>
+                <w:sz w:val="21"/>
+                <w:szCs w:val="21"/>
+              </w:rPr>
+              <w:t>dioptimasi</w:t>
+            </w:r>
+            <w:proofErr w:type="spellEnd"/>
+            <w:r>
+              <w:rPr>
+                <w:rFonts w:ascii="Times New Roman"/>
+                <w:sz w:val="21"/>
+                <w:szCs w:val="21"/>
+              </w:rPr>
+              <w:t xml:space="preserve"> (</w:t>
+            </w:r>
+            <w:proofErr w:type="spellStart"/>
+            <w:r>
+              <w:rPr>
+                <w:rFonts w:ascii="Times New Roman"/>
+                <w:i/>
+                <w:iCs/>
+                <w:sz w:val="21"/>
+                <w:szCs w:val="21"/>
+              </w:rPr>
+              <w:t>retopology</w:t>
+            </w:r>
+            <w:proofErr w:type="spellEnd"/>
+            <w:r>
+              <w:rPr>
+                <w:rFonts w:ascii="Times New Roman"/>
+                <w:sz w:val="21"/>
+                <w:szCs w:val="21"/>
+              </w:rPr>
+              <w:t xml:space="preserve">, perbaikan tekstur), dan disesuaikan ukurannya menggunakan perangkat lunak Blender agar performanya optimal saat dimuat di </w:t>
+            </w:r>
+            <w:proofErr w:type="spellStart"/>
+            <w:r>
+              <w:rPr>
+                <w:rFonts w:ascii="Times New Roman"/>
+                <w:sz w:val="21"/>
+                <w:szCs w:val="21"/>
+              </w:rPr>
+              <w:t>WebAR</w:t>
+            </w:r>
+            <w:proofErr w:type="spellEnd"/>
+            <w:r>
+              <w:rPr>
+                <w:rFonts w:ascii="Times New Roman"/>
+                <w:sz w:val="21"/>
+                <w:szCs w:val="21"/>
+              </w:rPr>
+              <w:t>.</w:t>
+            </w:r>
           </w:p>
         </w:tc>
       </w:tr>
@@ -10946,6 +11182,7 @@
                 <w:sz w:val="21"/>
                 <w:szCs w:val="21"/>
               </w:rPr>
+              <w:lastRenderedPageBreak/>
               <w:t>No.</w:t>
             </w:r>
           </w:p>
@@ -11258,7 +11495,6 @@
                 <w:sz w:val="21"/>
                 <w:szCs w:val="21"/>
               </w:rPr>
-              <w:lastRenderedPageBreak/>
               <w:t>4</w:t>
             </w:r>
           </w:p>
@@ -13122,6 +13358,7 @@
   <w:style w:type="character" w:default="1" w:styleId="DefaultParagraphFont">
     <w:name w:val="Default Paragraph Font"/>
     <w:uiPriority w:val="1"/>
+    <w:semiHidden/>
     <w:unhideWhenUsed/>
   </w:style>
   <w:style w:type="table" w:default="1" w:styleId="TableNormal">

</xml_diff>